<commit_message>
Update workshop address in all contract templates
</commit_message>
<xml_diff>
--- a/dogovor_final.docx
+++ b/dogovor_final.docx
@@ -5596,7 +5596,7 @@
                               <w:b/>
                               <w:sz w:val="16"/>
                             </w:rPr>
-                            <w:t>Москва,</w:t>
+                            <w:t>МО,</w:t>
                           </w:r>
                           <w:r>
                             <w:rPr>
@@ -5613,7 +5613,7 @@
                               <w:b/>
                               <w:sz w:val="16"/>
                             </w:rPr>
-                            <w:t>ул.</w:t>
+                            <w:t>Ярославский</w:t>
                           </w:r>
                           <w:r>
                             <w:rPr>
@@ -5630,7 +5630,7 @@
                               <w:b/>
                               <w:sz w:val="16"/>
                             </w:rPr>
-                            <w:t>Курганская,</w:t>
+                            <w:t>проезд,</w:t>
                           </w:r>
                           <w:r>
                             <w:rPr>
@@ -5647,7 +5647,7 @@
                               <w:b/>
                               <w:sz w:val="16"/>
                             </w:rPr>
-                            <w:t>д.</w:t>
+                            <w:t>7А</w:t>
                           </w:r>
                           <w:r>
                             <w:rPr>
@@ -5656,7 +5656,7 @@
                               <w:spacing w:val="-8"/>
                               <w:sz w:val="16"/>
                             </w:rPr>
-                            <w:t xml:space="preserve"> </w:t>
+                            <w:t xml:space="preserve"/>
                           </w:r>
                           <w:r>
                             <w:rPr>
@@ -5664,7 +5664,7 @@
                               <w:b/>
                               <w:sz w:val="16"/>
                             </w:rPr>
-                            <w:t>3а,</w:t>
+                            <w:t/>
                           </w:r>
                           <w:r>
                             <w:rPr>
@@ -5673,7 +5673,7 @@
                               <w:spacing w:val="-8"/>
                               <w:sz w:val="16"/>
                             </w:rPr>
-                            <w:t xml:space="preserve"> </w:t>
+                            <w:t xml:space="preserve"/>
                           </w:r>
                           <w:r>
                             <w:rPr>
@@ -5681,7 +5681,7 @@
                               <w:b/>
                               <w:sz w:val="16"/>
                             </w:rPr>
-                            <w:t xml:space="preserve">с.1 </w:t>
+                            <w:t xml:space="preserve"> </w:t>
                           </w:r>
                           <w:r>
                             <w:rPr>
@@ -5742,7 +5742,7 @@
                         <w:b/>
                         <w:sz w:val="16"/>
                       </w:rPr>
-                      <w:t>Москва,</w:t>
+                      <w:t>МО,</w:t>
                     </w:r>
                     <w:r>
                       <w:rPr>
@@ -5759,7 +5759,7 @@
                         <w:b/>
                         <w:sz w:val="16"/>
                       </w:rPr>
-                      <w:t>ул.</w:t>
+                      <w:t>Ярославский</w:t>
                     </w:r>
                     <w:r>
                       <w:rPr>
@@ -5776,7 +5776,7 @@
                         <w:b/>
                         <w:sz w:val="16"/>
                       </w:rPr>
-                      <w:t>Курганская,</w:t>
+                      <w:t>проезд,</w:t>
                     </w:r>
                     <w:r>
                       <w:rPr>
@@ -5793,7 +5793,7 @@
                         <w:b/>
                         <w:sz w:val="16"/>
                       </w:rPr>
-                      <w:t>д.</w:t>
+                      <w:t>7А</w:t>
                     </w:r>
                     <w:r>
                       <w:rPr>
@@ -5802,7 +5802,7 @@
                         <w:spacing w:val="-8"/>
                         <w:sz w:val="16"/>
                       </w:rPr>
-                      <w:t xml:space="preserve"> </w:t>
+                      <w:t xml:space="preserve"/>
                     </w:r>
                     <w:r>
                       <w:rPr>
@@ -5810,7 +5810,7 @@
                         <w:b/>
                         <w:sz w:val="16"/>
                       </w:rPr>
-                      <w:t>3а,</w:t>
+                      <w:t/>
                     </w:r>
                     <w:r>
                       <w:rPr>
@@ -5819,7 +5819,7 @@
                         <w:spacing w:val="-8"/>
                         <w:sz w:val="16"/>
                       </w:rPr>
-                      <w:t xml:space="preserve"> </w:t>
+                      <w:t xml:space="preserve"/>
                     </w:r>
                     <w:r>
                       <w:rPr>
@@ -5827,7 +5827,7 @@
                         <w:b/>
                         <w:sz w:val="16"/>
                       </w:rPr>
-                      <w:t xml:space="preserve">с.1 </w:t>
+                      <w:t xml:space="preserve"> </w:t>
                     </w:r>
                     <w:r>
                       <w:rPr>
@@ -6177,7 +6177,7 @@
                               <w:b/>
                               <w:sz w:val="16"/>
                             </w:rPr>
-                            <w:t>Москва,</w:t>
+                            <w:t>МО,</w:t>
                           </w:r>
                           <w:r>
                             <w:rPr>
@@ -6194,7 +6194,7 @@
                               <w:b/>
                               <w:sz w:val="16"/>
                             </w:rPr>
-                            <w:t>ул.</w:t>
+                            <w:t>Ярославский</w:t>
                           </w:r>
                           <w:r>
                             <w:rPr>
@@ -6211,7 +6211,7 @@
                               <w:b/>
                               <w:sz w:val="16"/>
                             </w:rPr>
-                            <w:t>Курганская,</w:t>
+                            <w:t>проезд,</w:t>
                           </w:r>
                           <w:r>
                             <w:rPr>
@@ -6228,7 +6228,7 @@
                               <w:b/>
                               <w:sz w:val="16"/>
                             </w:rPr>
-                            <w:t>д.</w:t>
+                            <w:t>7А</w:t>
                           </w:r>
                           <w:r>
                             <w:rPr>
@@ -6237,7 +6237,7 @@
                               <w:spacing w:val="-8"/>
                               <w:sz w:val="16"/>
                             </w:rPr>
-                            <w:t xml:space="preserve"> </w:t>
+                            <w:t xml:space="preserve"/>
                           </w:r>
                           <w:r>
                             <w:rPr>
@@ -6245,7 +6245,7 @@
                               <w:b/>
                               <w:sz w:val="16"/>
                             </w:rPr>
-                            <w:t>3а,</w:t>
+                            <w:t/>
                           </w:r>
                           <w:r>
                             <w:rPr>
@@ -6254,7 +6254,7 @@
                               <w:spacing w:val="-8"/>
                               <w:sz w:val="16"/>
                             </w:rPr>
-                            <w:t xml:space="preserve"> </w:t>
+                            <w:t xml:space="preserve"/>
                           </w:r>
                           <w:r>
                             <w:rPr>
@@ -6262,7 +6262,7 @@
                               <w:b/>
                               <w:sz w:val="16"/>
                             </w:rPr>
-                            <w:t xml:space="preserve">с.1 </w:t>
+                            <w:t xml:space="preserve"> </w:t>
                           </w:r>
                           <w:r>
                             <w:rPr>
@@ -6323,7 +6323,7 @@
                         <w:b/>
                         <w:sz w:val="16"/>
                       </w:rPr>
-                      <w:t>Москва,</w:t>
+                      <w:t>МО,</w:t>
                     </w:r>
                     <w:r>
                       <w:rPr>
@@ -6340,7 +6340,7 @@
                         <w:b/>
                         <w:sz w:val="16"/>
                       </w:rPr>
-                      <w:t>ул.</w:t>
+                      <w:t>Ярославский</w:t>
                     </w:r>
                     <w:r>
                       <w:rPr>
@@ -6357,7 +6357,7 @@
                         <w:b/>
                         <w:sz w:val="16"/>
                       </w:rPr>
-                      <w:t>Курганская,</w:t>
+                      <w:t>проезд,</w:t>
                     </w:r>
                     <w:r>
                       <w:rPr>
@@ -6374,7 +6374,7 @@
                         <w:b/>
                         <w:sz w:val="16"/>
                       </w:rPr>
-                      <w:t>д.</w:t>
+                      <w:t>7А</w:t>
                     </w:r>
                     <w:r>
                       <w:rPr>
@@ -6383,7 +6383,7 @@
                         <w:spacing w:val="-8"/>
                         <w:sz w:val="16"/>
                       </w:rPr>
-                      <w:t xml:space="preserve"> </w:t>
+                      <w:t xml:space="preserve"/>
                     </w:r>
                     <w:r>
                       <w:rPr>
@@ -6391,7 +6391,7 @@
                         <w:b/>
                         <w:sz w:val="16"/>
                       </w:rPr>
-                      <w:t>3а,</w:t>
+                      <w:t/>
                     </w:r>
                     <w:r>
                       <w:rPr>
@@ -6400,7 +6400,7 @@
                         <w:spacing w:val="-8"/>
                         <w:sz w:val="16"/>
                       </w:rPr>
-                      <w:t xml:space="preserve"> </w:t>
+                      <w:t xml:space="preserve"/>
                     </w:r>
                     <w:r>
                       <w:rPr>
@@ -6408,7 +6408,7 @@
                         <w:b/>
                         <w:sz w:val="16"/>
                       </w:rPr>
-                      <w:t xml:space="preserve">с.1 </w:t>
+                      <w:t xml:space="preserve"> </w:t>
                     </w:r>
                     <w:r>
                       <w:rPr>
@@ -6758,7 +6758,7 @@
                               <w:b/>
                               <w:sz w:val="16"/>
                             </w:rPr>
-                            <w:t>Москва,</w:t>
+                            <w:t>МО,</w:t>
                           </w:r>
                           <w:r>
                             <w:rPr>
@@ -6775,7 +6775,7 @@
                               <w:b/>
                               <w:sz w:val="16"/>
                             </w:rPr>
-                            <w:t>ул.</w:t>
+                            <w:t>Ярославский</w:t>
                           </w:r>
                           <w:r>
                             <w:rPr>
@@ -6792,7 +6792,7 @@
                               <w:b/>
                               <w:sz w:val="16"/>
                             </w:rPr>
-                            <w:t>Курганская,</w:t>
+                            <w:t>проезд,</w:t>
                           </w:r>
                           <w:r>
                             <w:rPr>
@@ -6809,7 +6809,7 @@
                               <w:b/>
                               <w:sz w:val="16"/>
                             </w:rPr>
-                            <w:t>д.</w:t>
+                            <w:t>7А</w:t>
                           </w:r>
                           <w:r>
                             <w:rPr>
@@ -6818,7 +6818,7 @@
                               <w:spacing w:val="-8"/>
                               <w:sz w:val="16"/>
                             </w:rPr>
-                            <w:t xml:space="preserve"> </w:t>
+                            <w:t xml:space="preserve"/>
                           </w:r>
                           <w:r>
                             <w:rPr>
@@ -6826,7 +6826,7 @@
                               <w:b/>
                               <w:sz w:val="16"/>
                             </w:rPr>
-                            <w:t>3а,</w:t>
+                            <w:t/>
                           </w:r>
                           <w:r>
                             <w:rPr>
@@ -6835,7 +6835,7 @@
                               <w:spacing w:val="-8"/>
                               <w:sz w:val="16"/>
                             </w:rPr>
-                            <w:t xml:space="preserve"> </w:t>
+                            <w:t xml:space="preserve"/>
                           </w:r>
                           <w:r>
                             <w:rPr>
@@ -6843,7 +6843,7 @@
                               <w:b/>
                               <w:sz w:val="16"/>
                             </w:rPr>
-                            <w:t xml:space="preserve">с.1 </w:t>
+                            <w:t xml:space="preserve"> </w:t>
                           </w:r>
                           <w:r>
                             <w:rPr>
@@ -6904,7 +6904,7 @@
                         <w:b/>
                         <w:sz w:val="16"/>
                       </w:rPr>
-                      <w:t>Москва,</w:t>
+                      <w:t>МО,</w:t>
                     </w:r>
                     <w:r>
                       <w:rPr>
@@ -6921,7 +6921,7 @@
                         <w:b/>
                         <w:sz w:val="16"/>
                       </w:rPr>
-                      <w:t>ул.</w:t>
+                      <w:t>Ярославский</w:t>
                     </w:r>
                     <w:r>
                       <w:rPr>
@@ -6938,7 +6938,7 @@
                         <w:b/>
                         <w:sz w:val="16"/>
                       </w:rPr>
-                      <w:t>Курганская,</w:t>
+                      <w:t>проезд,</w:t>
                     </w:r>
                     <w:r>
                       <w:rPr>
@@ -6955,7 +6955,7 @@
                         <w:b/>
                         <w:sz w:val="16"/>
                       </w:rPr>
-                      <w:t>д.</w:t>
+                      <w:t>7А</w:t>
                     </w:r>
                     <w:r>
                       <w:rPr>
@@ -6964,7 +6964,7 @@
                         <w:spacing w:val="-8"/>
                         <w:sz w:val="16"/>
                       </w:rPr>
-                      <w:t xml:space="preserve"> </w:t>
+                      <w:t xml:space="preserve"/>
                     </w:r>
                     <w:r>
                       <w:rPr>
@@ -6972,7 +6972,7 @@
                         <w:b/>
                         <w:sz w:val="16"/>
                       </w:rPr>
-                      <w:t>3а,</w:t>
+                      <w:t/>
                     </w:r>
                     <w:r>
                       <w:rPr>
@@ -6981,7 +6981,7 @@
                         <w:spacing w:val="-8"/>
                         <w:sz w:val="16"/>
                       </w:rPr>
-                      <w:t xml:space="preserve"> </w:t>
+                      <w:t xml:space="preserve"/>
                     </w:r>
                     <w:r>
                       <w:rPr>
@@ -6989,7 +6989,7 @@
                         <w:b/>
                         <w:sz w:val="16"/>
                       </w:rPr>
-                      <w:t xml:space="preserve">с.1 </w:t>
+                      <w:t xml:space="preserve"> </w:t>
                     </w:r>
                     <w:r>
                       <w:rPr>

</xml_diff>